<commit_message>
Update midterm future work and current evaluation evidence
</commit_message>
<xml_diff>
--- a/assignments/2026-10-12/midterm/Midterm_Writeup.docx
+++ b/assignments/2026-10-12/midterm/Midterm_Writeup.docx
@@ -25,7 +25,7 @@
     </w:p>
     <w:p>
       <w:r>
-        <w:t>We built a local English-language assistant for users who can state a research question but need help choosing and interpreting a statistical analysis. It accepts a CSV and a question, clarifies variable roles and study design, runs a supported test and explains the evidence. Our Python LangGraph StateGraph has 17 nodes and supports Welch independent-samples t-tests, Pearson correlation, chi-square tests of independence and simple ordinary least-squares regression. The current interface is a command line or notebook. Its main unresolved problem is the reliability of interpretation review.</w:t>
+        <w:t>We built a local English-language assistant for users who can state a research question but need help choosing and interpreting a statistical analysis. It accepts a CSV and a question, clarifies variable roles and study design, runs a supported test and explains the evidence. Our Python LangGraph StateGraph has 17 nodes and supports Welch independent-samples t-tests, Pearson correlation, chi-square tests of independence and simple ordinary least-squares regression. The current interfaces are a local browser, command line and notebook. Its main unresolved problem is the reliability of interpretation review.</w:t>
       </w:r>
     </w:p>
     <w:p>
@@ -97,7 +97,7 @@
     </w:p>
     <w:p>
       <w:r>
-        <w:t>The workflow checks relevant column types, missing or nonfinite values, usable sample sizes and variable variation, with method-specific diagnostics and warnings. Chi-square checks expected cell frequencies; unsupported sparse tables can stop analysis. When problem data require correction or exclusion, the assistant pauses for explicit user confirmation and a reason. It preserves the original data and records the modification. Paired or clustered designs, multivariable regression and automatic searches for alternative tests remain outside the supported scope. A warning or passing diagnostic does not establish that the statistical assumptions hold.</w:t>
+        <w:t>The workflow checks column types, missing or nonfinite values, sample sizes and variable variation. Chi-square checks expected cell frequencies; unsupported sparse tables can stop analysis. OLS includes Cook's distance, leverage and a studentized Breusch-Pagan diagnostic for unequal error variance. Flags prompt caution, not automatic removal or estimator changes. Data corrections and exclusions require explicit user confirmation; explanatory notes are optional. The original data and modification log are preserved. Paired or clustered designs and multivariable regression remain outside the current scope. A passing diagnostic does not prove that assumptions hold.</w:t>
       </w:r>
     </w:p>
     <w:p>
@@ -128,12 +128,30 @@
     </w:p>
     <w:p>
       <w:r>
-        <w:t>All 93 automated mock tests pass, and the current demo and submission notebooks completed their 14 and 15 code cells in mock mode. Historical real local two-model runs delivered four supported methods and two follow-ups across initial runs and targeted reruns. This is evidence of execution, not a single fresh full run or a model accuracy rate.</w:t>
+        <w:t>At implementation snapshot 4ebe82c, all 192 software tests passed. Live evaluation on 31 predefined scenarios met adapted workflow expectations in 27 cases; all 19 assessed numerical comparisons matched their references. In a separate controlled Model B evaluation, all four valid report templates were accepted and ten of twelve planted errors were caught. The two missed errors show that an independent model does not guarantee a faithful interpretation. These are automated checks; independent human scoring is pending.</w:t>
+      </w:r>
+    </w:p>
+    <w:p>
+      <w:pPr>
+        <w:pStyle w:val="Heading1"/>
+      </w:pPr>
+      <w:r>
+        <w:t>Future work</w:t>
       </w:r>
     </w:p>
     <w:p>
       <w:r>
-        <w:t>Independent human scoring has not been completed. Next, we will evaluate held-out ordinary, ambiguous and failing cases using an independent rubric for method choice, target, numerical fidelity, uncertainty, missing-data handling and causal restraint. Reviewers will record misleading sentences and reasons before resolving disagreements. We will also log reviewer false positives and missed errors. Our strongest evidence is reproducible numerical execution; interpretation reliability remains the main open question.</w:t>
+        <w:t>Human evaluation. Data correction and exclusion confirmations already exist. We will complete the prepared human_review.csv rubric with independent ratings for method choice, numerical fidelity and interpretation, recording misleading claims and reviewer disagreement. We may add selective analyst review for unresolved issues.</w:t>
+      </w:r>
+    </w:p>
+    <w:p>
+      <w:r>
+        <w:t>Broader methods. We will extend selection beyond the four basic methods to paired comparisons and multivariable regression, with design-specific assumptions and diagnostics. Each alternative must answer the intended statistical question; a rank test is not an automatic substitute for comparing means.</w:t>
+      </w:r>
+    </w:p>
+    <w:p>
+      <w:r>
+        <w:t>Real-world datasets. Current benchmarks use controlled synthetic data. We will add curated public datasets, such as Kaggle datasets, after checking provenance, variable definitions and research design. Analyst reference analyses will assess suitable methods and responsible interpretation. Synthetic benchmarks will remain for reproducible numerical checks.</w:t>
       </w:r>
     </w:p>
     <w:sectPr>

</xml_diff>